<commit_message>
fix(guides): correct teal-600 in DI template (#1C5552 → #14706D)
The template was built with the wrong teal-600 hex from a spec typo
(#1C5552 instead of the actual design-system.css value #14706D). Fixed
in Heading 2, Heading 3, and the footer wordmark color. Forest-700
(#294843) was already correct.

Co-Authored-By: Claude Opus 4.7 (1M context) <noreply@anthropic.com>
</commit_message>
<xml_diff>
--- a/Claude-Created-Exam-Section-guides/_dyer-innovation-template.docx
+++ b/Claude-Created-Exam-Section-guides/_dyer-innovation-template.docx
@@ -341,7 +341,7 @@
     <w:r>
       <w:rPr>
         <w:rFonts w:ascii="Newsreader" w:hAnsi="Newsreader" w:cs="Newsreader" w:eastAsia="Newsreader"/>
-        <w:color w:val="1C5552"/>
+        <w:color w:val="14706D"/>
         <w:sz w:val="18"/>
       </w:rPr>
       <w:t>D Y E R   I N N O V A T I O N</w:t>
@@ -352,7 +352,7 @@
     <w:r>
       <w:rPr>
         <w:rFonts w:ascii="Geist" w:hAnsi="Geist" w:cs="Geist" w:eastAsia="Geist"/>
-        <w:color w:val="1C5552"/>
+        <w:color w:val="14706D"/>
         <w:sz w:val="18"/>
       </w:rPr>
       <w:fldSimple w:instr="PAGE">
@@ -751,7 +751,7 @@
     <w:rPr>
       <w:rFonts w:asciiTheme="majorHAnsi" w:eastAsiaTheme="majorEastAsia" w:hAnsiTheme="majorHAnsi" w:cstheme="majorBidi" w:ascii="Newsreader" w:hAnsi="Newsreader" w:cs="Newsreader" w:eastAsia="Newsreader"/>
       <w:b/>
-      <w:color w:val="1C5552"/>
+      <w:color w:val="14706D"/>
       <w:sz w:val="40"/>
       <w:szCs w:val="32"/>
     </w:rPr>
@@ -775,7 +775,7 @@
     <w:rPr>
       <w:rFonts w:eastAsiaTheme="majorEastAsia" w:cstheme="majorBidi" w:ascii="Newsreader" w:hAnsi="Newsreader" w:cs="Newsreader" w:eastAsia="Newsreader"/>
       <w:b/>
-      <w:color w:val="1C5552"/>
+      <w:color w:val="14706D"/>
       <w:sz w:val="32"/>
       <w:szCs w:val="28"/>
     </w:rPr>

</xml_diff>